<commit_message>
Add documentation and new files for determinant calculation project
- Introduced `GUIA_APRESENTACAO.md` detailing the project structure, methods, and usage instructions.
- Added a lock file for `Relatorio de Gaal.docx` to track changes.
- Updated `README.md` with enhanced descriptions and usage examples for the determinant calculation program.
</commit_message>
<xml_diff>
--- a/Relatorio de Gaal.docx
+++ b/Relatorio de Gaal.docx
@@ -258,7 +258,7 @@
           <w:szCs w:val="30"/>
           <w:rtl w:val="0"/>
         </w:rPr>
-        <w:t xml:space="preserve">Metadologia: </w:t>
+        <w:t xml:space="preserve">Metodologia: </w:t>
       </w:r>
       <w:r>
         <w:rPr>
@@ -266,17 +266,7 @@
           <w:szCs w:val="28"/>
           <w:rtl w:val="0"/>
         </w:rPr>
-        <w:t xml:space="preserve">O trabalho foi desenvolvido por meio da implementação de dois algoritmos para cálculo de determinantes: Expansão por Cofatores e Operações Elementares. Inicialmente foi realizado um estudo teórico dos métodos, seguido pela implementação dos algoritmos na linguagem(Coloca as linguagens utilizadas). Em seguida, foram executados testes com matrizes quadradas de ordens entre 2 e 6, registrando-se os valores dos determinantes, as etapas intermediárias dos cálculos e os tempos de execução. Os resultados obtidos foram comparados para verificar a consistência dos valores calculados e avaliar a eficiência computacional de cada método. Por fim, foi realizada uma análise dos tempos de execução e da complexidade dos algoritmos, permitindo identificar as vantagens e limitações de cada abordagem.</w:t>
-      </w:r>
-      <w:r>
-        <w:rPr>
-          <w:b w:val="1"/>
-          <w:bCs w:val="1"/>
-          <w:sz w:val="34"/>
-          <w:szCs w:val="34"/>
-          <w:rtl w:val="0"/>
-        </w:rPr>
-        <w:t xml:space="preserve"> // pedro se quiser complementar.</w:t>
+        <w:t xml:space="preserve">O trabalho foi desenvolvido em Python (matplotlib e numpy). Implementamos dois algoritmos: (1) expansão por cofatores, recursiva pela 1ª linha, com registro de chamadas e operações; (2) operações elementares, triangularizando a matriz por eliminação de Gauss com pivotamento parcial, registrando trocas de linha e correção de sinal. Testamos matrizes quadradas de ordem 2 a 6 (entrada manual e geração aleatória), comparando determinantes, etapas intermediárias e tempos de execução. A corretude foi validada com numpy.linalg.det. Gráficos de tempo, operações e speedup compararam o crescimento ~O(n!) dos cofatores com ~O(n³) das operações elementares.</w:t>
       </w:r>
       <w:r>
         <w:rPr>
@@ -766,49 +756,49 @@
           <w:szCs w:val="30"/>
           <w:rtl w:val="0"/>
         </w:rPr>
-        <w:t xml:space="preserve">Pedro: </w:t>
-      </w:r>
-    </w:p>
-    <w:p>
-      <w:pPr>
-        <w:spacing w:after="160" w:lineRule="auto"/>
-        <w:rPr>
-          <w:b w:val="1"/>
-          <w:bCs w:val="1"/>
-          <w:sz w:val="30"/>
-          <w:szCs w:val="30"/>
-        </w:rPr>
-      </w:pPr>
-      <w:r>
-        <w:rPr>
-          <w:b w:val="1"/>
-          <w:bCs w:val="1"/>
-          <w:sz w:val="30"/>
-          <w:szCs w:val="30"/>
-          <w:rtl w:val="0"/>
-        </w:rPr>
-        <w:t xml:space="preserve">Rafael Gomide: </w:t>
-      </w:r>
-    </w:p>
-    <w:p>
-      <w:pPr>
-        <w:spacing w:after="160" w:lineRule="auto"/>
-        <w:rPr>
-          <w:b w:val="1"/>
-          <w:bCs w:val="1"/>
-          <w:sz w:val="30"/>
-          <w:szCs w:val="30"/>
-        </w:rPr>
-      </w:pPr>
-      <w:r>
-        <w:rPr>
-          <w:b w:val="1"/>
-          <w:bCs w:val="1"/>
-          <w:sz w:val="30"/>
-          <w:szCs w:val="30"/>
-          <w:rtl w:val="0"/>
-        </w:rPr>
-        <w:t xml:space="preserve">Rafael Vilela: </w:t>
+        <w:t xml:space="preserve">Pedro: Implementação do método de operações elementares (triangularização com pivotamento).</w:t>
+      </w:r>
+    </w:p>
+    <w:p>
+      <w:pPr>
+        <w:spacing w:after="160" w:lineRule="auto"/>
+        <w:rPr>
+          <w:b w:val="1"/>
+          <w:bCs w:val="1"/>
+          <w:sz w:val="30"/>
+          <w:szCs w:val="30"/>
+        </w:rPr>
+      </w:pPr>
+      <w:r>
+        <w:rPr>
+          <w:b w:val="1"/>
+          <w:bCs w:val="1"/>
+          <w:sz w:val="30"/>
+          <w:szCs w:val="30"/>
+          <w:rtl w:val="0"/>
+        </w:rPr>
+        <w:t xml:space="preserve">Rafael Gomide: Implementação do método de operações elementares e estrutura do projeto.</w:t>
+      </w:r>
+    </w:p>
+    <w:p>
+      <w:pPr>
+        <w:spacing w:after="160" w:lineRule="auto"/>
+        <w:rPr>
+          <w:b w:val="1"/>
+          <w:bCs w:val="1"/>
+          <w:sz w:val="30"/>
+          <w:szCs w:val="30"/>
+        </w:rPr>
+      </w:pPr>
+      <w:r>
+        <w:rPr>
+          <w:b w:val="1"/>
+          <w:bCs w:val="1"/>
+          <w:sz w:val="30"/>
+          <w:szCs w:val="30"/>
+          <w:rtl w:val="0"/>
+        </w:rPr>
+        <w:t xml:space="preserve">Rafael Vilela: Implementação da expansão por cofatores.</w:t>
       </w:r>
     </w:p>
     <w:p>

</xml_diff>